<commit_message>
feat (HR Forms): added Identification Document type and Number values
</commit_message>
<xml_diff>
--- a/public/templates/Certificate_Of_Employment.docx
+++ b/public/templates/Certificate_Of_Employment.docx
@@ -28,7 +28,6 @@
         </w:rPr>
         <w:br/>
       </w:r>
-      <w:proofErr w:type="spellStart"/>
       <w:r>
         <w:rPr>
           <w:rFonts w:ascii="Browallia New" w:eastAsia="Aptos" w:hAnsi="Browallia New" w:cs="Browallia New" w:hint="cs"/>
@@ -38,7 +37,6 @@
         </w:rPr>
         <w:t>หนังสือรับรองการทำงาน</w:t>
       </w:r>
-      <w:proofErr w:type="spellEnd"/>
     </w:p>
     <w:p>
       <w:pPr>
@@ -71,7 +69,6 @@
         </w:rPr>
         <w:t xml:space="preserve">Date / </w:t>
       </w:r>
-      <w:proofErr w:type="spellStart"/>
       <w:r>
         <w:rPr>
           <w:rFonts w:ascii="Browallia New" w:eastAsia="Aptos" w:hAnsi="Browallia New" w:cs="Browallia New"/>
@@ -82,7 +79,6 @@
         </w:rPr>
         <w:t>วันที่</w:t>
       </w:r>
-      <w:proofErr w:type="spellEnd"/>
       <w:r>
         <w:rPr>
           <w:rFonts w:ascii="Aptos" w:eastAsia="Aptos" w:hAnsi="Aptos" w:cs="Aptos"/>
@@ -139,7 +135,6 @@
           <w:szCs w:val="24"/>
         </w:rPr>
       </w:pPr>
-      <w:proofErr w:type="spellStart"/>
       <w:r>
         <w:rPr>
           <w:rFonts w:ascii="Browallia New" w:eastAsia="Aptos" w:hAnsi="Browallia New" w:cs="Browallia New"/>
@@ -148,7 +143,6 @@
         </w:rPr>
         <w:t>ถึง</w:t>
       </w:r>
-      <w:proofErr w:type="spellEnd"/>
       <w:r>
         <w:rPr>
           <w:rFonts w:ascii="Aptos" w:eastAsia="Aptos" w:hAnsi="Aptos" w:cs="Aptos"/>
@@ -157,7 +151,6 @@
         </w:rPr>
         <w:t xml:space="preserve"> </w:t>
       </w:r>
-      <w:proofErr w:type="spellStart"/>
       <w:r>
         <w:rPr>
           <w:rFonts w:ascii="Browallia New" w:eastAsia="Aptos" w:hAnsi="Browallia New" w:cs="Browallia New"/>
@@ -166,7 +159,6 @@
         </w:rPr>
         <w:t>ผู้ที่เกี่ยวข้อง</w:t>
       </w:r>
-      <w:proofErr w:type="spellEnd"/>
     </w:p>
     <w:p>
       <w:pPr>
@@ -231,7 +223,6 @@
           <w:szCs w:val="24"/>
         </w:rPr>
       </w:pPr>
-      <w:proofErr w:type="spellStart"/>
       <w:r>
         <w:rPr>
           <w:rFonts w:ascii="Browallia New" w:eastAsia="Aptos" w:hAnsi="Browallia New" w:cs="Browallia New"/>
@@ -240,7 +231,6 @@
         </w:rPr>
         <w:t>หนังสือฉบับนี้รับรองว่า</w:t>
       </w:r>
-      <w:proofErr w:type="spellEnd"/>
       <w:r>
         <w:rPr>
           <w:rFonts w:ascii="Aptos" w:eastAsia="Aptos" w:hAnsi="Aptos" w:cs="Aptos"/>
@@ -267,7 +257,6 @@
         </w:rPr>
         <w:t xml:space="preserve"> </w:t>
       </w:r>
-      <w:proofErr w:type="spellStart"/>
       <w:r>
         <w:rPr>
           <w:rFonts w:ascii="Browallia New" w:eastAsia="Aptos" w:hAnsi="Browallia New" w:cs="Browallia New"/>
@@ -276,7 +265,6 @@
         </w:rPr>
         <w:t>เป็นพนักงานอย่างเป็นทางการของ</w:t>
       </w:r>
-      <w:proofErr w:type="spellEnd"/>
       <w:r>
         <w:rPr>
           <w:rFonts w:ascii="Aptos" w:eastAsia="Aptos" w:hAnsi="Aptos" w:cs="Aptos"/>
@@ -284,6 +272,14 @@
           <w:szCs w:val="24"/>
         </w:rPr>
         <w:t xml:space="preserve"> {{TRADING_NAME}} ({{COMPANY_LEGAL_NAME}})</w:t>
+      </w:r>
+      <w:r>
+        <w:rPr>
+          <w:rFonts w:ascii="Aptos" w:eastAsia="Aptos" w:hAnsi="Aptos" w:cs="Aptos"/>
+          <w:sz w:val="24"/>
+          <w:szCs w:val="24"/>
+        </w:rPr>
+        <w:t>.</w:t>
       </w:r>
     </w:p>
     <w:p>
@@ -301,6 +297,152 @@
         <w:spacing w:line="276" w:lineRule="auto"/>
         <w:rPr>
           <w:rFonts w:ascii="Aptos" w:eastAsia="Aptos" w:hAnsi="Aptos" w:cs="Aptos"/>
+          <w:sz w:val="24"/>
+          <w:szCs w:val="24"/>
+        </w:rPr>
+      </w:pPr>
+      <w:r>
+        <w:rPr>
+          <w:rFonts w:ascii="Aptos" w:eastAsia="Aptos" w:hAnsi="Aptos" w:cs="Aptos"/>
+          <w:sz w:val="24"/>
+          <w:szCs w:val="24"/>
+        </w:rPr>
+        <w:t>Identity Document</w:t>
+      </w:r>
+      <w:r>
+        <w:rPr>
+          <w:rFonts w:ascii="Aptos" w:eastAsia="Aptos" w:hAnsi="Aptos" w:cs="Aptos"/>
+          <w:sz w:val="24"/>
+          <w:szCs w:val="24"/>
+        </w:rPr>
+        <w:t xml:space="preserve"> / </w:t>
+      </w:r>
+      <w:r>
+        <w:rPr>
+          <w:rFonts w:ascii="Browallia New" w:eastAsia="Aptos" w:hAnsi="Browallia New" w:cs="Browallia New"/>
+          <w:sz w:val="24"/>
+          <w:szCs w:val="24"/>
+        </w:rPr>
+        <w:t>ประเภทบัตร</w:t>
+      </w:r>
+      <w:r>
+        <w:rPr>
+          <w:rFonts w:ascii="Aptos" w:eastAsia="Aptos" w:hAnsi="Aptos" w:cs="Aptos"/>
+          <w:sz w:val="24"/>
+          <w:szCs w:val="24"/>
+        </w:rPr>
+        <w:t xml:space="preserve">: </w:t>
+      </w:r>
+      <w:r>
+        <w:rPr>
+          <w:rFonts w:ascii="Aptos" w:eastAsia="Aptos" w:hAnsi="Aptos" w:cs="Aptos"/>
+          <w:sz w:val="24"/>
+          <w:szCs w:val="24"/>
+        </w:rPr>
+        <w:t>{{</w:t>
+      </w:r>
+      <w:r>
+        <w:rPr>
+          <w:rFonts w:ascii="Aptos" w:eastAsia="Aptos" w:hAnsi="Aptos" w:cs="Aptos"/>
+          <w:sz w:val="24"/>
+          <w:szCs w:val="24"/>
+        </w:rPr>
+        <w:t>ID_TYPE</w:t>
+      </w:r>
+      <w:r>
+        <w:rPr>
+          <w:rFonts w:ascii="Aptos" w:eastAsia="Aptos" w:hAnsi="Aptos" w:cs="Aptos"/>
+          <w:sz w:val="24"/>
+          <w:szCs w:val="24"/>
+        </w:rPr>
+        <w:t>}}</w:t>
+      </w:r>
+      <w:r>
+        <w:rPr>
+          <w:rFonts w:ascii="Aptos" w:eastAsia="Aptos" w:hAnsi="Aptos" w:cs="Aptos"/>
+          <w:sz w:val="24"/>
+          <w:szCs w:val="24"/>
+        </w:rPr>
+        <w:br/>
+      </w:r>
+      <w:r>
+        <w:rPr>
+          <w:rFonts w:ascii="Aptos" w:eastAsia="Aptos" w:hAnsi="Aptos" w:cs="Aptos"/>
+          <w:sz w:val="24"/>
+          <w:szCs w:val="24"/>
+        </w:rPr>
+        <w:t>ID Number</w:t>
+      </w:r>
+      <w:r>
+        <w:rPr>
+          <w:rFonts w:ascii="Aptos" w:eastAsia="Aptos" w:hAnsi="Aptos" w:cs="Aptos"/>
+          <w:sz w:val="24"/>
+          <w:szCs w:val="24"/>
+        </w:rPr>
+        <w:t xml:space="preserve"> / </w:t>
+      </w:r>
+      <w:r>
+        <w:rPr>
+          <w:rFonts w:ascii="Browallia New" w:eastAsia="Aptos" w:hAnsi="Browallia New" w:cs="Browallia New"/>
+          <w:sz w:val="24"/>
+          <w:szCs w:val="24"/>
+        </w:rPr>
+        <w:t>เลขที่เอกสาร</w:t>
+      </w:r>
+      <w:r>
+        <w:rPr>
+          <w:rFonts w:ascii="Aptos" w:eastAsia="Aptos" w:hAnsi="Aptos" w:cs="Aptos"/>
+          <w:sz w:val="24"/>
+          <w:szCs w:val="24"/>
+        </w:rPr>
+        <w:t>:</w:t>
+      </w:r>
+      <w:r>
+        <w:rPr>
+          <w:rFonts w:ascii="Aptos" w:eastAsia="Aptos" w:hAnsi="Aptos" w:cs="Aptos"/>
+          <w:sz w:val="24"/>
+          <w:szCs w:val="24"/>
+        </w:rPr>
+        <w:t xml:space="preserve"> </w:t>
+      </w:r>
+      <w:r>
+        <w:rPr>
+          <w:rFonts w:ascii="Aptos" w:eastAsia="Aptos" w:hAnsi="Aptos" w:cs="Aptos"/>
+          <w:sz w:val="24"/>
+          <w:szCs w:val="24"/>
+        </w:rPr>
+        <w:t>{{ID_</w:t>
+      </w:r>
+      <w:r>
+        <w:rPr>
+          <w:rFonts w:ascii="Aptos" w:eastAsia="Aptos" w:hAnsi="Aptos" w:cs="Aptos"/>
+          <w:sz w:val="24"/>
+          <w:szCs w:val="24"/>
+        </w:rPr>
+        <w:t>NUMBER</w:t>
+      </w:r>
+      <w:r>
+        <w:rPr>
+          <w:rFonts w:ascii="Aptos" w:eastAsia="Aptos" w:hAnsi="Aptos" w:cs="Aptos"/>
+          <w:sz w:val="24"/>
+          <w:szCs w:val="24"/>
+        </w:rPr>
+        <w:t>}}</w:t>
+      </w:r>
+      <w:r>
+        <w:rPr>
+          <w:rFonts w:ascii="Aptos" w:eastAsia="Aptos" w:hAnsi="Aptos" w:cs="Aptos"/>
+          <w:sz w:val="24"/>
+          <w:szCs w:val="24"/>
+        </w:rPr>
+        <w:br/>
+      </w:r>
+    </w:p>
+    <w:p>
+      <w:pPr>
+        <w:spacing w:line="276" w:lineRule="auto"/>
+        <w:rPr>
+          <w:rFonts w:ascii="Aptos" w:eastAsia="Aptos" w:hAnsi="Aptos" w:cs="Aptos"/>
           <w:b/>
           <w:bCs/>
           <w:sz w:val="24"/>
@@ -317,7 +459,6 @@
         </w:rPr>
         <w:t xml:space="preserve">Employment Details / </w:t>
       </w:r>
-      <w:proofErr w:type="spellStart"/>
       <w:r>
         <w:rPr>
           <w:rFonts w:ascii="Browallia New" w:eastAsia="Aptos" w:hAnsi="Browallia New" w:cs="Browallia New"/>
@@ -328,7 +469,6 @@
         </w:rPr>
         <w:t>รายละเอียดการจ้างงาน</w:t>
       </w:r>
-      <w:proofErr w:type="spellEnd"/>
       <w:r>
         <w:rPr>
           <w:rFonts w:ascii="Aptos" w:eastAsia="Aptos" w:hAnsi="Aptos" w:cs="Aptos"/>
@@ -357,7 +497,6 @@
         </w:rPr>
         <w:t xml:space="preserve">Job Title / </w:t>
       </w:r>
-      <w:proofErr w:type="spellStart"/>
       <w:r>
         <w:rPr>
           <w:rFonts w:ascii="Browallia New" w:eastAsia="Aptos" w:hAnsi="Browallia New" w:cs="Browallia New"/>
@@ -366,7 +505,6 @@
         </w:rPr>
         <w:t>ตำแหน่งงาน</w:t>
       </w:r>
-      <w:proofErr w:type="spellEnd"/>
       <w:r>
         <w:rPr>
           <w:rFonts w:ascii="Aptos" w:eastAsia="Aptos" w:hAnsi="Aptos" w:cs="Aptos"/>
@@ -393,7 +531,6 @@
         </w:rPr>
         <w:t xml:space="preserve">Start Date / </w:t>
       </w:r>
-      <w:proofErr w:type="spellStart"/>
       <w:r>
         <w:rPr>
           <w:rFonts w:ascii="Browallia New" w:eastAsia="Aptos" w:hAnsi="Browallia New" w:cs="Browallia New"/>
@@ -402,7 +539,6 @@
         </w:rPr>
         <w:t>วันเริ่มงาน</w:t>
       </w:r>
-      <w:proofErr w:type="spellEnd"/>
       <w:r>
         <w:rPr>
           <w:rFonts w:ascii="Aptos" w:eastAsia="Aptos" w:hAnsi="Aptos" w:cs="Aptos"/>
@@ -429,7 +565,6 @@
         </w:rPr>
         <w:t xml:space="preserve">Current Salary / </w:t>
       </w:r>
-      <w:proofErr w:type="spellStart"/>
       <w:r>
         <w:rPr>
           <w:rFonts w:ascii="Browallia New" w:eastAsia="Aptos" w:hAnsi="Browallia New" w:cs="Browallia New"/>
@@ -438,7 +573,6 @@
         </w:rPr>
         <w:t>เงินเดือนปัจจุบัน</w:t>
       </w:r>
-      <w:proofErr w:type="spellEnd"/>
       <w:r>
         <w:rPr>
           <w:rFonts w:ascii="Aptos" w:eastAsia="Aptos" w:hAnsi="Aptos" w:cs="Aptos"/>
@@ -485,7 +619,6 @@
           <w:szCs w:val="24"/>
         </w:rPr>
       </w:pPr>
-      <w:proofErr w:type="spellStart"/>
       <w:r>
         <w:rPr>
           <w:rFonts w:ascii="Browallia New" w:eastAsia="Aptos" w:hAnsi="Browallia New" w:cs="Browallia New"/>
@@ -494,7 +627,6 @@
         </w:rPr>
         <w:t>หนังสือรับรองฉบับนี้ออกตามคำร้องขอของพนักงาน</w:t>
       </w:r>
-      <w:proofErr w:type="spellEnd"/>
       <w:r>
         <w:rPr>
           <w:rFonts w:ascii="Aptos" w:eastAsia="Aptos" w:hAnsi="Aptos" w:cs="Aptos"/>
@@ -503,7 +635,6 @@
         </w:rPr>
         <w:t xml:space="preserve"> </w:t>
       </w:r>
-      <w:proofErr w:type="spellStart"/>
       <w:r>
         <w:rPr>
           <w:rFonts w:ascii="Browallia New" w:eastAsia="Aptos" w:hAnsi="Browallia New" w:cs="Browallia New"/>
@@ -512,7 +643,6 @@
         </w:rPr>
         <w:t>เพื่อนำไปใช้เป็นหลักฐานตามความประสงค์</w:t>
       </w:r>
-      <w:proofErr w:type="spellEnd"/>
     </w:p>
     <w:p>
       <w:pPr>
@@ -541,7 +671,6 @@
         </w:rPr>
         <w:t xml:space="preserve">Sincerely / </w:t>
       </w:r>
-      <w:proofErr w:type="spellStart"/>
       <w:r>
         <w:rPr>
           <w:rFonts w:ascii="Browallia New" w:eastAsia="Aptos" w:hAnsi="Browallia New" w:cs="Browallia New"/>
@@ -550,7 +679,6 @@
         </w:rPr>
         <w:t>ขอแสดงความนับถือ</w:t>
       </w:r>
-      <w:proofErr w:type="spellEnd"/>
       <w:r>
         <w:rPr>
           <w:rFonts w:ascii="Aptos" w:eastAsia="Aptos" w:hAnsi="Aptos" w:cs="Aptos"/>
@@ -708,8 +836,7 @@
       </w:r>
     </w:p>
     <w:sectPr>
-      <w:headerReference w:type="default" r:id="rId7"/>
-      <w:footerReference w:type="default" r:id="rId8"/>
+      <w:footerReference w:type="default" r:id="rId7"/>
       <w:pgSz w:w="11906" w:h="16838"/>
       <w:pgMar w:top="540" w:right="1440" w:bottom="1088" w:left="1440" w:header="0" w:footer="720" w:gutter="0"/>
       <w:pgNumType w:start="1"/>
@@ -929,12 +1056,6 @@
     </w:p>
   </w:footnote>
 </w:footnotes>
-</file>
-
-<file path=word/header1.xml><?xml version="1.0" encoding="utf-8"?>
-<w:hdr xmlns:wpc="http://schemas.microsoft.com/office/word/2010/wordprocessingCanvas" xmlns:cx="http://schemas.microsoft.com/office/drawing/2014/chartex" xmlns:cx1="http://schemas.microsoft.com/office/drawing/2015/9/8/chartex" xmlns:cx2="http://schemas.microsoft.com/office/drawing/2015/10/21/chartex" xmlns:cx3="http://schemas.microsoft.com/office/drawing/2016/5/9/chartex" xmlns:cx4="http://schemas.microsoft.com/office/drawing/2016/5/10/chartex" xmlns:cx5="http://schemas.microsoft.com/office/drawing/2016/5/11/chartex" xmlns:cx6="http://schemas.microsoft.com/office/drawing/2016/5/12/chartex" xmlns:cx7="http://schemas.microsoft.com/office/drawing/2016/5/13/chartex" xmlns:cx8="http://schemas.microsoft.com/office/drawing/2016/5/14/chartex" xmlns:mc="http://schemas.openxmlformats.org/markup-compatibility/2006" xmlns:aink="http://schemas.microsoft.com/office/drawing/2016/ink" xmlns:am3d="http://schemas.microsoft.com/office/drawing/2017/model3d" xmlns:o="urn:schemas-microsoft-com:office:office" xmlns:oel="http://schemas.microsoft.com/office/2019/extlst" xmlns:r="http://schemas.openxmlformats.org/officeDocument/2006/relationships" xmlns:m="http://schemas.openxmlformats.org/officeDocument/2006/math" xmlns:v="urn:schemas-microsoft-com:vml" xmlns:wp14="http://schemas.microsoft.com/office/word/2010/wordprocessingDrawing" xmlns:wp="http://schemas.openxmlformats.org/drawingml/2006/wordprocessingDrawing" xmlns:w10="urn:schemas-microsoft-com:office:word" xmlns:w="http://schemas.openxmlformats.org/wordprocessingml/2006/main" xmlns:w14="http://schemas.microsoft.com/office/word/2010/wordml" xmlns:w15="http://schemas.microsoft.com/office/word/2012/wordml" xmlns:w16cex="http://schemas.microsoft.com/office/word/2018/wordml/cex" xmlns:w16cid="http://schemas.microsoft.com/office/word/2016/wordml/cid" xmlns:w16="http://schemas.microsoft.com/office/word/2018/wordml" xmlns:w16du="http://schemas.microsoft.com/office/word/2023/wordml/word16du" xmlns:w16sdtdh="http://schemas.microsoft.com/office/word/2020/wordml/sdtdatahash" xmlns:w16sdtfl="http://schemas.microsoft.com/office/word/2024/wordml/sdtformatlock" xmlns:w16se="http://schemas.microsoft.com/office/word/2015/wordml/symex" xmlns:wpg="http://schemas.microsoft.com/office/word/2010/wordprocessingGroup" xmlns:wpi="http://schemas.microsoft.com/office/word/2010/wordprocessingInk" xmlns:wne="http://schemas.microsoft.com/office/word/2006/wordml" xmlns:wps="http://schemas.microsoft.com/office/word/2010/wordprocessingShape" mc:Ignorable="w14 w15 w16se w16cid w16 w16cex w16sdtdh w16sdtfl w16du wp14">
-  <w:p/>
-</w:hdr>
 </file>
 
 <file path=word/intelligence2.xml><?xml version="1.0" encoding="utf-8"?>
@@ -5562,7 +5683,6 @@
   <w:style w:type="character" w:default="1" w:styleId="DefaultParagraphFont">
     <w:name w:val="Default Paragraph Font"/>
     <w:uiPriority w:val="1"/>
-    <w:semiHidden/>
     <w:unhideWhenUsed/>
   </w:style>
   <w:style w:type="table" w:default="1" w:styleId="TableNormal">
@@ -5653,7 +5773,6 @@
     <w:basedOn w:val="Normal"/>
     <w:link w:val="HeaderChar"/>
     <w:uiPriority w:val="99"/>
-    <w:semiHidden/>
     <w:unhideWhenUsed/>
     <w:rsid w:val="008B4B5E"/>
     <w:pPr>
@@ -5668,7 +5787,6 @@
     <w:basedOn w:val="DefaultParagraphFont"/>
     <w:link w:val="Header"/>
     <w:uiPriority w:val="99"/>
-    <w:semiHidden/>
     <w:rsid w:val="008B4B5E"/>
   </w:style>
   <w:style w:type="paragraph" w:styleId="Footer">
@@ -5676,7 +5794,6 @@
     <w:basedOn w:val="Normal"/>
     <w:link w:val="FooterChar"/>
     <w:uiPriority w:val="99"/>
-    <w:semiHidden/>
     <w:unhideWhenUsed/>
     <w:rsid w:val="008B4B5E"/>
     <w:pPr>
@@ -5691,7 +5808,6 @@
     <w:basedOn w:val="DefaultParagraphFont"/>
     <w:link w:val="Footer"/>
     <w:uiPriority w:val="99"/>
-    <w:semiHidden/>
     <w:rsid w:val="008B4B5E"/>
   </w:style>
 </w:styles>

</xml_diff>